<commit_message>
This will override everything to date.
</commit_message>
<xml_diff>
--- a/assets/Word Docs Information/Fonts-and-Colours.docx
+++ b/assets/Word Docs Information/Fonts-and-Colours.docx
@@ -476,21 +476,7 @@
           <w:lang w:eastAsia="en-GB"/>
           <w14:ligatures w14:val="none"/>
         </w:rPr>
-        <w:t xml:space="preserve">Documentary Colour Themes </w:t>
-      </w:r>
-      <w:proofErr w:type="gramStart"/>
-      <w:r>
-        <w:rPr>
-          <w:rFonts w:ascii="Meiryo" w:eastAsia="Meiryo" w:hAnsi="Meiryo" w:cs="Times New Roman"/>
-          <w:b/>
-          <w:bCs/>
-          <w:kern w:val="0"/>
-          <w:sz w:val="36"/>
-          <w:szCs w:val="36"/>
-          <w:lang w:eastAsia="en-GB"/>
-          <w14:ligatures w14:val="none"/>
-        </w:rPr>
-        <w:t>(</w:t>
+        <w:t>Documentary Colour Themes (</w:t>
       </w:r>
       <w:r>
         <w:rPr>
@@ -505,7 +491,6 @@
         </w:rPr>
         <w:t>:root</w:t>
       </w:r>
-      <w:proofErr w:type="gramEnd"/>
       <w:r>
         <w:rPr>
           <w:rFonts w:ascii="Meiryo" w:eastAsia="Meiryo" w:hAnsi="Meiryo" w:cs="Times New Roman"/>
@@ -944,25 +929,14 @@
           <w14:ligatures w14:val="none"/>
         </w:rPr>
       </w:pPr>
-      <w:proofErr w:type="spellStart"/>
-      <w:r>
-        <w:rPr>
-          <w:rFonts w:ascii="Meiryo" w:eastAsia="Meiryo" w:hAnsi="Meiryo" w:cs="Times New Roman"/>
-          <w:kern w:val="0"/>
-          <w:lang w:eastAsia="en-GB"/>
-          <w14:ligatures w14:val="none"/>
-        </w:rPr>
-        <w:t>NatGeo</w:t>
-      </w:r>
-      <w:proofErr w:type="spellEnd"/>
-      <w:r>
-        <w:rPr>
-          <w:rFonts w:ascii="Meiryo" w:eastAsia="Meiryo" w:hAnsi="Meiryo" w:cs="Times New Roman"/>
-          <w:kern w:val="0"/>
-          <w:lang w:eastAsia="en-GB"/>
-          <w14:ligatures w14:val="none"/>
-        </w:rPr>
-        <w:t xml:space="preserve"> yellow / Ocean blue / Nature green</w:t>
+      <w:r>
+        <w:rPr>
+          <w:rFonts w:ascii="Meiryo" w:eastAsia="Meiryo" w:hAnsi="Meiryo" w:cs="Times New Roman"/>
+          <w:kern w:val="0"/>
+          <w:lang w:eastAsia="en-GB"/>
+          <w14:ligatures w14:val="none"/>
+        </w:rPr>
+        <w:t>NatGeo yellow / Ocean blue / Nature green</w:t>
       </w:r>
     </w:p>
     <w:p>
@@ -1205,25 +1179,14 @@
           <w14:ligatures w14:val="none"/>
         </w:rPr>
       </w:pPr>
-      <w:proofErr w:type="spellStart"/>
-      <w:r>
-        <w:rPr>
-          <w:rFonts w:ascii="Meiryo" w:eastAsia="Meiryo" w:hAnsi="Meiryo" w:cs="Times New Roman"/>
-          <w:kern w:val="0"/>
-          <w:lang w:eastAsia="en-GB"/>
-          <w14:ligatures w14:val="none"/>
-        </w:rPr>
-        <w:t>NatGeo</w:t>
-      </w:r>
-      <w:proofErr w:type="spellEnd"/>
-      <w:r>
-        <w:rPr>
-          <w:rFonts w:ascii="Meiryo" w:eastAsia="Meiryo" w:hAnsi="Meiryo" w:cs="Times New Roman"/>
-          <w:kern w:val="0"/>
-          <w:lang w:eastAsia="en-GB"/>
-          <w14:ligatures w14:val="none"/>
-        </w:rPr>
-        <w:t xml:space="preserve"> Yellow</w:t>
+      <w:r>
+        <w:rPr>
+          <w:rFonts w:ascii="Meiryo" w:eastAsia="Meiryo" w:hAnsi="Meiryo" w:cs="Times New Roman"/>
+          <w:kern w:val="0"/>
+          <w:lang w:eastAsia="en-GB"/>
+          <w14:ligatures w14:val="none"/>
+        </w:rPr>
+        <w:t>NatGeo Yellow</w:t>
       </w:r>
     </w:p>
     <w:p>
@@ -1274,6 +1237,1405 @@
         </w:rPr>
         <w:t>Gold</w:t>
       </w:r>
+    </w:p>
+    <w:p>
+      <w:pPr>
+        <w:pStyle w:val="ListParagraph"/>
+        <w:numPr>
+          <w:ilvl w:val="0"/>
+          <w:numId w:val="6"/>
+        </w:numPr>
+        <w:shd w:val="clear" w:color="auto" w:fill="121314"/>
+        <w:spacing w:after="0" w:line="285" w:lineRule="atLeast"/>
+        <w:rPr>
+          <w:rFonts w:ascii="Consolas" w:eastAsia="Times New Roman" w:hAnsi="Consolas" w:cs="Times New Roman"/>
+          <w:color w:val="BBBEBF"/>
+          <w:kern w:val="0"/>
+          <w:sz w:val="21"/>
+          <w:szCs w:val="21"/>
+          <w:lang w:eastAsia="en-GB"/>
+          <w14:ligatures w14:val="none"/>
+        </w:rPr>
+      </w:pPr>
+      <w:r>
+        <w:rPr>
+          <w:rFonts w:ascii="Consolas" w:eastAsia="Times New Roman" w:hAnsi="Consolas" w:cs="Times New Roman"/>
+          <w:color w:val="8B949E"/>
+          <w:kern w:val="0"/>
+          <w:sz w:val="21"/>
+          <w:szCs w:val="21"/>
+          <w:lang w:eastAsia="en-GB"/>
+          <w14:ligatures w14:val="none"/>
+        </w:rPr>
+        <w:t>/* Google fonts for site */</w:t>
+      </w:r>
+    </w:p>
+    <w:p>
+      <w:pPr>
+        <w:pStyle w:val="ListParagraph"/>
+        <w:numPr>
+          <w:ilvl w:val="0"/>
+          <w:numId w:val="6"/>
+        </w:numPr>
+        <w:shd w:val="clear" w:color="auto" w:fill="121314"/>
+        <w:spacing w:after="0" w:line="285" w:lineRule="atLeast"/>
+        <w:rPr>
+          <w:rFonts w:ascii="Consolas" w:eastAsia="Times New Roman" w:hAnsi="Consolas" w:cs="Times New Roman"/>
+          <w:color w:val="BBBEBF"/>
+          <w:kern w:val="0"/>
+          <w:sz w:val="21"/>
+          <w:szCs w:val="21"/>
+          <w:lang w:eastAsia="en-GB"/>
+          <w14:ligatures w14:val="none"/>
+        </w:rPr>
+      </w:pPr>
+      <w:r>
+        <w:rPr>
+          <w:rFonts w:ascii="Consolas" w:eastAsia="Times New Roman" w:hAnsi="Consolas" w:cs="Times New Roman"/>
+          <w:color w:val="C586C0"/>
+          <w:kern w:val="0"/>
+          <w:sz w:val="21"/>
+          <w:szCs w:val="21"/>
+          <w:lang w:eastAsia="en-GB"/>
+          <w14:ligatures w14:val="none"/>
+        </w:rPr>
+        <w:t>@import</w:t>
+      </w:r>
+      <w:r>
+        <w:rPr>
+          <w:rFonts w:ascii="Consolas" w:eastAsia="Times New Roman" w:hAnsi="Consolas" w:cs="Times New Roman"/>
+          <w:color w:val="BBBEBF"/>
+          <w:kern w:val="0"/>
+          <w:sz w:val="21"/>
+          <w:szCs w:val="21"/>
+          <w:lang w:eastAsia="en-GB"/>
+          <w14:ligatures w14:val="none"/>
+        </w:rPr>
+        <w:t xml:space="preserve"> </w:t>
+      </w:r>
+      <w:r>
+        <w:rPr>
+          <w:rFonts w:ascii="Consolas" w:eastAsia="Times New Roman" w:hAnsi="Consolas" w:cs="Times New Roman"/>
+          <w:color w:val="DCDCAA"/>
+          <w:kern w:val="0"/>
+          <w:sz w:val="21"/>
+          <w:szCs w:val="21"/>
+          <w:lang w:eastAsia="en-GB"/>
+          <w14:ligatures w14:val="none"/>
+        </w:rPr>
+        <w:t>url</w:t>
+      </w:r>
+      <w:r>
+        <w:rPr>
+          <w:rFonts w:ascii="Consolas" w:eastAsia="Times New Roman" w:hAnsi="Consolas" w:cs="Times New Roman"/>
+          <w:color w:val="BBBEBF"/>
+          <w:kern w:val="0"/>
+          <w:sz w:val="21"/>
+          <w:szCs w:val="21"/>
+          <w:lang w:eastAsia="en-GB"/>
+          <w14:ligatures w14:val="none"/>
+        </w:rPr>
+        <w:t>(</w:t>
+      </w:r>
+      <w:r>
+        <w:rPr>
+          <w:rFonts w:ascii="Consolas" w:eastAsia="Times New Roman" w:hAnsi="Consolas" w:cs="Times New Roman"/>
+          <w:color w:val="A5D6FF"/>
+          <w:kern w:val="0"/>
+          <w:sz w:val="21"/>
+          <w:szCs w:val="21"/>
+          <w:lang w:eastAsia="en-GB"/>
+          <w14:ligatures w14:val="none"/>
+        </w:rPr>
+        <w:t>'https://fonts.googleapis.com/css2?family=Inter:ital,opsz,wght@0,14..32,100..900;1,14..32,100..900&amp;family=Lato:ital,wght@0,100;0,300;0,400;0,700;0,900;1,100;1,300;1,400;1,700;1,900&amp;family=Manrope:wght@200..800&amp;display=swap'</w:t>
+      </w:r>
+      <w:r>
+        <w:rPr>
+          <w:rFonts w:ascii="Consolas" w:eastAsia="Times New Roman" w:hAnsi="Consolas" w:cs="Times New Roman"/>
+          <w:color w:val="BBBEBF"/>
+          <w:kern w:val="0"/>
+          <w:sz w:val="21"/>
+          <w:szCs w:val="21"/>
+          <w:lang w:eastAsia="en-GB"/>
+          <w14:ligatures w14:val="none"/>
+        </w:rPr>
+        <w:t>);</w:t>
+      </w:r>
+    </w:p>
+    <w:p>
+      <w:pPr>
+        <w:pStyle w:val="ListParagraph"/>
+        <w:numPr>
+          <w:ilvl w:val="0"/>
+          <w:numId w:val="6"/>
+        </w:numPr>
+        <w:shd w:val="clear" w:color="auto" w:fill="121314"/>
+        <w:spacing w:after="0" w:line="285" w:lineRule="atLeast"/>
+        <w:rPr>
+          <w:rFonts w:ascii="Consolas" w:eastAsia="Times New Roman" w:hAnsi="Consolas" w:cs="Times New Roman"/>
+          <w:color w:val="BBBEBF"/>
+          <w:kern w:val="0"/>
+          <w:sz w:val="21"/>
+          <w:szCs w:val="21"/>
+          <w:lang w:eastAsia="en-GB"/>
+          <w14:ligatures w14:val="none"/>
+        </w:rPr>
+      </w:pPr>
+    </w:p>
+    <w:p>
+      <w:pPr>
+        <w:pStyle w:val="ListParagraph"/>
+        <w:numPr>
+          <w:ilvl w:val="0"/>
+          <w:numId w:val="6"/>
+        </w:numPr>
+        <w:shd w:val="clear" w:color="auto" w:fill="121314"/>
+        <w:spacing w:after="0" w:line="285" w:lineRule="atLeast"/>
+        <w:rPr>
+          <w:rFonts w:ascii="Consolas" w:eastAsia="Times New Roman" w:hAnsi="Consolas" w:cs="Times New Roman"/>
+          <w:color w:val="BBBEBF"/>
+          <w:kern w:val="0"/>
+          <w:sz w:val="21"/>
+          <w:szCs w:val="21"/>
+          <w:lang w:eastAsia="en-GB"/>
+          <w14:ligatures w14:val="none"/>
+        </w:rPr>
+      </w:pPr>
+      <w:r>
+        <w:rPr>
+          <w:rFonts w:ascii="Consolas" w:eastAsia="Times New Roman" w:hAnsi="Consolas" w:cs="Times New Roman"/>
+          <w:color w:val="D7BA7D"/>
+          <w:kern w:val="0"/>
+          <w:sz w:val="21"/>
+          <w:szCs w:val="21"/>
+          <w:lang w:eastAsia="en-GB"/>
+          <w14:ligatures w14:val="none"/>
+        </w:rPr>
+        <w:t>:root.cinematic-dark</w:t>
+      </w:r>
+      <w:r>
+        <w:rPr>
+          <w:rFonts w:ascii="Consolas" w:eastAsia="Times New Roman" w:hAnsi="Consolas" w:cs="Times New Roman"/>
+          <w:color w:val="BBBEBF"/>
+          <w:kern w:val="0"/>
+          <w:sz w:val="21"/>
+          <w:szCs w:val="21"/>
+          <w:lang w:eastAsia="en-GB"/>
+          <w14:ligatures w14:val="none"/>
+        </w:rPr>
+        <w:t xml:space="preserve"> {</w:t>
+      </w:r>
+    </w:p>
+    <w:p>
+      <w:pPr>
+        <w:pStyle w:val="ListParagraph"/>
+        <w:numPr>
+          <w:ilvl w:val="0"/>
+          <w:numId w:val="6"/>
+        </w:numPr>
+        <w:shd w:val="clear" w:color="auto" w:fill="121314"/>
+        <w:spacing w:after="0" w:line="285" w:lineRule="atLeast"/>
+        <w:rPr>
+          <w:rFonts w:ascii="Consolas" w:eastAsia="Times New Roman" w:hAnsi="Consolas" w:cs="Times New Roman"/>
+          <w:color w:val="BBBEBF"/>
+          <w:kern w:val="0"/>
+          <w:sz w:val="21"/>
+          <w:szCs w:val="21"/>
+          <w:lang w:eastAsia="en-GB"/>
+          <w14:ligatures w14:val="none"/>
+        </w:rPr>
+      </w:pPr>
+      <w:r>
+        <w:rPr>
+          <w:rFonts w:ascii="Consolas" w:eastAsia="Times New Roman" w:hAnsi="Consolas" w:cs="Times New Roman"/>
+          <w:color w:val="BBBEBF"/>
+          <w:kern w:val="0"/>
+          <w:sz w:val="21"/>
+          <w:szCs w:val="21"/>
+          <w:lang w:eastAsia="en-GB"/>
+          <w14:ligatures w14:val="none"/>
+        </w:rPr>
+        <w:t xml:space="preserve">  </w:t>
+      </w:r>
+      <w:r>
+        <w:rPr>
+          <w:rFonts w:ascii="Consolas" w:eastAsia="Times New Roman" w:hAnsi="Consolas" w:cs="Times New Roman"/>
+          <w:color w:val="9CDCFE"/>
+          <w:kern w:val="0"/>
+          <w:sz w:val="21"/>
+          <w:szCs w:val="21"/>
+          <w:lang w:eastAsia="en-GB"/>
+          <w14:ligatures w14:val="none"/>
+        </w:rPr>
+        <w:t>--color-bg-primary</w:t>
+      </w:r>
+      <w:r>
+        <w:rPr>
+          <w:rFonts w:ascii="Consolas" w:eastAsia="Times New Roman" w:hAnsi="Consolas" w:cs="Times New Roman"/>
+          <w:color w:val="BBBEBF"/>
+          <w:kern w:val="0"/>
+          <w:sz w:val="21"/>
+          <w:szCs w:val="21"/>
+          <w:lang w:eastAsia="en-GB"/>
+          <w14:ligatures w14:val="none"/>
+        </w:rPr>
+        <w:t xml:space="preserve">: </w:t>
+      </w:r>
+      <w:r>
+        <w:rPr>
+          <w:rFonts w:ascii="Consolas" w:eastAsia="Times New Roman" w:hAnsi="Consolas" w:cs="Times New Roman"/>
+          <w:color w:val="CE9178"/>
+          <w:kern w:val="0"/>
+          <w:sz w:val="21"/>
+          <w:szCs w:val="21"/>
+          <w:lang w:eastAsia="en-GB"/>
+          <w14:ligatures w14:val="none"/>
+        </w:rPr>
+        <w:t>#0D0D0D</w:t>
+      </w:r>
+      <w:r>
+        <w:rPr>
+          <w:rFonts w:ascii="Consolas" w:eastAsia="Times New Roman" w:hAnsi="Consolas" w:cs="Times New Roman"/>
+          <w:color w:val="BBBEBF"/>
+          <w:kern w:val="0"/>
+          <w:sz w:val="21"/>
+          <w:szCs w:val="21"/>
+          <w:lang w:eastAsia="en-GB"/>
+          <w14:ligatures w14:val="none"/>
+        </w:rPr>
+        <w:t>;</w:t>
+      </w:r>
+    </w:p>
+    <w:p>
+      <w:pPr>
+        <w:pStyle w:val="ListParagraph"/>
+        <w:numPr>
+          <w:ilvl w:val="0"/>
+          <w:numId w:val="6"/>
+        </w:numPr>
+        <w:shd w:val="clear" w:color="auto" w:fill="121314"/>
+        <w:spacing w:after="0" w:line="285" w:lineRule="atLeast"/>
+        <w:rPr>
+          <w:rFonts w:ascii="Consolas" w:eastAsia="Times New Roman" w:hAnsi="Consolas" w:cs="Times New Roman"/>
+          <w:color w:val="BBBEBF"/>
+          <w:kern w:val="0"/>
+          <w:sz w:val="21"/>
+          <w:szCs w:val="21"/>
+          <w:lang w:eastAsia="en-GB"/>
+          <w14:ligatures w14:val="none"/>
+        </w:rPr>
+      </w:pPr>
+      <w:r>
+        <w:rPr>
+          <w:rFonts w:ascii="Consolas" w:eastAsia="Times New Roman" w:hAnsi="Consolas" w:cs="Times New Roman"/>
+          <w:color w:val="BBBEBF"/>
+          <w:kern w:val="0"/>
+          <w:sz w:val="21"/>
+          <w:szCs w:val="21"/>
+          <w:lang w:eastAsia="en-GB"/>
+          <w14:ligatures w14:val="none"/>
+        </w:rPr>
+        <w:t xml:space="preserve">  </w:t>
+      </w:r>
+      <w:r>
+        <w:rPr>
+          <w:rFonts w:ascii="Consolas" w:eastAsia="Times New Roman" w:hAnsi="Consolas" w:cs="Times New Roman"/>
+          <w:color w:val="9CDCFE"/>
+          <w:kern w:val="0"/>
+          <w:sz w:val="21"/>
+          <w:szCs w:val="21"/>
+          <w:lang w:eastAsia="en-GB"/>
+          <w14:ligatures w14:val="none"/>
+        </w:rPr>
+        <w:t>--color-bg-secondary</w:t>
+      </w:r>
+      <w:r>
+        <w:rPr>
+          <w:rFonts w:ascii="Consolas" w:eastAsia="Times New Roman" w:hAnsi="Consolas" w:cs="Times New Roman"/>
+          <w:color w:val="BBBEBF"/>
+          <w:kern w:val="0"/>
+          <w:sz w:val="21"/>
+          <w:szCs w:val="21"/>
+          <w:lang w:eastAsia="en-GB"/>
+          <w14:ligatures w14:val="none"/>
+        </w:rPr>
+        <w:t xml:space="preserve">: </w:t>
+      </w:r>
+      <w:r>
+        <w:rPr>
+          <w:rFonts w:ascii="Consolas" w:eastAsia="Times New Roman" w:hAnsi="Consolas" w:cs="Times New Roman"/>
+          <w:color w:val="CE9178"/>
+          <w:kern w:val="0"/>
+          <w:sz w:val="21"/>
+          <w:szCs w:val="21"/>
+          <w:lang w:eastAsia="en-GB"/>
+          <w14:ligatures w14:val="none"/>
+        </w:rPr>
+        <w:t>#1A1A1A</w:t>
+      </w:r>
+      <w:r>
+        <w:rPr>
+          <w:rFonts w:ascii="Consolas" w:eastAsia="Times New Roman" w:hAnsi="Consolas" w:cs="Times New Roman"/>
+          <w:color w:val="BBBEBF"/>
+          <w:kern w:val="0"/>
+          <w:sz w:val="21"/>
+          <w:szCs w:val="21"/>
+          <w:lang w:eastAsia="en-GB"/>
+          <w14:ligatures w14:val="none"/>
+        </w:rPr>
+        <w:t>;</w:t>
+      </w:r>
+    </w:p>
+    <w:p>
+      <w:pPr>
+        <w:pStyle w:val="ListParagraph"/>
+        <w:numPr>
+          <w:ilvl w:val="0"/>
+          <w:numId w:val="6"/>
+        </w:numPr>
+        <w:shd w:val="clear" w:color="auto" w:fill="121314"/>
+        <w:spacing w:after="0" w:line="285" w:lineRule="atLeast"/>
+        <w:rPr>
+          <w:rFonts w:ascii="Consolas" w:eastAsia="Times New Roman" w:hAnsi="Consolas" w:cs="Times New Roman"/>
+          <w:color w:val="BBBEBF"/>
+          <w:kern w:val="0"/>
+          <w:sz w:val="21"/>
+          <w:szCs w:val="21"/>
+          <w:lang w:eastAsia="en-GB"/>
+          <w14:ligatures w14:val="none"/>
+        </w:rPr>
+      </w:pPr>
+      <w:r>
+        <w:rPr>
+          <w:rFonts w:ascii="Consolas" w:eastAsia="Times New Roman" w:hAnsi="Consolas" w:cs="Times New Roman"/>
+          <w:color w:val="BBBEBF"/>
+          <w:kern w:val="0"/>
+          <w:sz w:val="21"/>
+          <w:szCs w:val="21"/>
+          <w:lang w:eastAsia="en-GB"/>
+          <w14:ligatures w14:val="none"/>
+        </w:rPr>
+        <w:t xml:space="preserve">  </w:t>
+      </w:r>
+      <w:r>
+        <w:rPr>
+          <w:rFonts w:ascii="Consolas" w:eastAsia="Times New Roman" w:hAnsi="Consolas" w:cs="Times New Roman"/>
+          <w:color w:val="9CDCFE"/>
+          <w:kern w:val="0"/>
+          <w:sz w:val="21"/>
+          <w:szCs w:val="21"/>
+          <w:lang w:eastAsia="en-GB"/>
+          <w14:ligatures w14:val="none"/>
+        </w:rPr>
+        <w:t>--color-bg-tertiary</w:t>
+      </w:r>
+      <w:r>
+        <w:rPr>
+          <w:rFonts w:ascii="Consolas" w:eastAsia="Times New Roman" w:hAnsi="Consolas" w:cs="Times New Roman"/>
+          <w:color w:val="BBBEBF"/>
+          <w:kern w:val="0"/>
+          <w:sz w:val="21"/>
+          <w:szCs w:val="21"/>
+          <w:lang w:eastAsia="en-GB"/>
+          <w14:ligatures w14:val="none"/>
+        </w:rPr>
+        <w:t xml:space="preserve">: </w:t>
+      </w:r>
+      <w:r>
+        <w:rPr>
+          <w:rFonts w:ascii="Consolas" w:eastAsia="Times New Roman" w:hAnsi="Consolas" w:cs="Times New Roman"/>
+          <w:color w:val="CE9178"/>
+          <w:kern w:val="0"/>
+          <w:sz w:val="21"/>
+          <w:szCs w:val="21"/>
+          <w:lang w:eastAsia="en-GB"/>
+          <w14:ligatures w14:val="none"/>
+        </w:rPr>
+        <w:t>#2E2E2E</w:t>
+      </w:r>
+      <w:r>
+        <w:rPr>
+          <w:rFonts w:ascii="Consolas" w:eastAsia="Times New Roman" w:hAnsi="Consolas" w:cs="Times New Roman"/>
+          <w:color w:val="BBBEBF"/>
+          <w:kern w:val="0"/>
+          <w:sz w:val="21"/>
+          <w:szCs w:val="21"/>
+          <w:lang w:eastAsia="en-GB"/>
+          <w14:ligatures w14:val="none"/>
+        </w:rPr>
+        <w:t>;</w:t>
+      </w:r>
+    </w:p>
+    <w:p>
+      <w:pPr>
+        <w:pStyle w:val="ListParagraph"/>
+        <w:numPr>
+          <w:ilvl w:val="0"/>
+          <w:numId w:val="6"/>
+        </w:numPr>
+        <w:shd w:val="clear" w:color="auto" w:fill="121314"/>
+        <w:spacing w:after="0" w:line="285" w:lineRule="atLeast"/>
+        <w:rPr>
+          <w:rFonts w:ascii="Consolas" w:eastAsia="Times New Roman" w:hAnsi="Consolas" w:cs="Times New Roman"/>
+          <w:color w:val="BBBEBF"/>
+          <w:kern w:val="0"/>
+          <w:sz w:val="21"/>
+          <w:szCs w:val="21"/>
+          <w:lang w:eastAsia="en-GB"/>
+          <w14:ligatures w14:val="none"/>
+        </w:rPr>
+      </w:pPr>
+    </w:p>
+    <w:p>
+      <w:pPr>
+        <w:pStyle w:val="ListParagraph"/>
+        <w:numPr>
+          <w:ilvl w:val="0"/>
+          <w:numId w:val="6"/>
+        </w:numPr>
+        <w:shd w:val="clear" w:color="auto" w:fill="121314"/>
+        <w:spacing w:after="0" w:line="285" w:lineRule="atLeast"/>
+        <w:rPr>
+          <w:rFonts w:ascii="Consolas" w:eastAsia="Times New Roman" w:hAnsi="Consolas" w:cs="Times New Roman"/>
+          <w:color w:val="BBBEBF"/>
+          <w:kern w:val="0"/>
+          <w:sz w:val="21"/>
+          <w:szCs w:val="21"/>
+          <w:lang w:eastAsia="en-GB"/>
+          <w14:ligatures w14:val="none"/>
+        </w:rPr>
+      </w:pPr>
+      <w:r>
+        <w:rPr>
+          <w:rFonts w:ascii="Consolas" w:eastAsia="Times New Roman" w:hAnsi="Consolas" w:cs="Times New Roman"/>
+          <w:color w:val="BBBEBF"/>
+          <w:kern w:val="0"/>
+          <w:sz w:val="21"/>
+          <w:szCs w:val="21"/>
+          <w:lang w:eastAsia="en-GB"/>
+          <w14:ligatures w14:val="none"/>
+        </w:rPr>
+        <w:t xml:space="preserve">  </w:t>
+      </w:r>
+      <w:r>
+        <w:rPr>
+          <w:rFonts w:ascii="Consolas" w:eastAsia="Times New Roman" w:hAnsi="Consolas" w:cs="Times New Roman"/>
+          <w:color w:val="9CDCFE"/>
+          <w:kern w:val="0"/>
+          <w:sz w:val="21"/>
+          <w:szCs w:val="21"/>
+          <w:lang w:eastAsia="en-GB"/>
+          <w14:ligatures w14:val="none"/>
+        </w:rPr>
+        <w:t>--color-text-primary</w:t>
+      </w:r>
+      <w:r>
+        <w:rPr>
+          <w:rFonts w:ascii="Consolas" w:eastAsia="Times New Roman" w:hAnsi="Consolas" w:cs="Times New Roman"/>
+          <w:color w:val="BBBEBF"/>
+          <w:kern w:val="0"/>
+          <w:sz w:val="21"/>
+          <w:szCs w:val="21"/>
+          <w:lang w:eastAsia="en-GB"/>
+          <w14:ligatures w14:val="none"/>
+        </w:rPr>
+        <w:t xml:space="preserve">: </w:t>
+      </w:r>
+      <w:r>
+        <w:rPr>
+          <w:rFonts w:ascii="Consolas" w:eastAsia="Times New Roman" w:hAnsi="Consolas" w:cs="Times New Roman"/>
+          <w:color w:val="CE9178"/>
+          <w:kern w:val="0"/>
+          <w:sz w:val="21"/>
+          <w:szCs w:val="21"/>
+          <w:lang w:eastAsia="en-GB"/>
+          <w14:ligatures w14:val="none"/>
+        </w:rPr>
+        <w:t>#F5F5F5</w:t>
+      </w:r>
+      <w:r>
+        <w:rPr>
+          <w:rFonts w:ascii="Consolas" w:eastAsia="Times New Roman" w:hAnsi="Consolas" w:cs="Times New Roman"/>
+          <w:color w:val="BBBEBF"/>
+          <w:kern w:val="0"/>
+          <w:sz w:val="21"/>
+          <w:szCs w:val="21"/>
+          <w:lang w:eastAsia="en-GB"/>
+          <w14:ligatures w14:val="none"/>
+        </w:rPr>
+        <w:t>;</w:t>
+      </w:r>
+    </w:p>
+    <w:p>
+      <w:pPr>
+        <w:pStyle w:val="ListParagraph"/>
+        <w:numPr>
+          <w:ilvl w:val="0"/>
+          <w:numId w:val="6"/>
+        </w:numPr>
+        <w:shd w:val="clear" w:color="auto" w:fill="121314"/>
+        <w:spacing w:after="0" w:line="285" w:lineRule="atLeast"/>
+        <w:rPr>
+          <w:rFonts w:ascii="Consolas" w:eastAsia="Times New Roman" w:hAnsi="Consolas" w:cs="Times New Roman"/>
+          <w:color w:val="BBBEBF"/>
+          <w:kern w:val="0"/>
+          <w:sz w:val="21"/>
+          <w:szCs w:val="21"/>
+          <w:lang w:eastAsia="en-GB"/>
+          <w14:ligatures w14:val="none"/>
+        </w:rPr>
+      </w:pPr>
+      <w:r>
+        <w:rPr>
+          <w:rFonts w:ascii="Consolas" w:eastAsia="Times New Roman" w:hAnsi="Consolas" w:cs="Times New Roman"/>
+          <w:color w:val="BBBEBF"/>
+          <w:kern w:val="0"/>
+          <w:sz w:val="21"/>
+          <w:szCs w:val="21"/>
+          <w:lang w:eastAsia="en-GB"/>
+          <w14:ligatures w14:val="none"/>
+        </w:rPr>
+        <w:t xml:space="preserve">  </w:t>
+      </w:r>
+      <w:r>
+        <w:rPr>
+          <w:rFonts w:ascii="Consolas" w:eastAsia="Times New Roman" w:hAnsi="Consolas" w:cs="Times New Roman"/>
+          <w:color w:val="9CDCFE"/>
+          <w:kern w:val="0"/>
+          <w:sz w:val="21"/>
+          <w:szCs w:val="21"/>
+          <w:lang w:eastAsia="en-GB"/>
+          <w14:ligatures w14:val="none"/>
+        </w:rPr>
+        <w:t>--color-text-secondary</w:t>
+      </w:r>
+      <w:r>
+        <w:rPr>
+          <w:rFonts w:ascii="Consolas" w:eastAsia="Times New Roman" w:hAnsi="Consolas" w:cs="Times New Roman"/>
+          <w:color w:val="BBBEBF"/>
+          <w:kern w:val="0"/>
+          <w:sz w:val="21"/>
+          <w:szCs w:val="21"/>
+          <w:lang w:eastAsia="en-GB"/>
+          <w14:ligatures w14:val="none"/>
+        </w:rPr>
+        <w:t xml:space="preserve">: </w:t>
+      </w:r>
+      <w:r>
+        <w:rPr>
+          <w:rFonts w:ascii="Consolas" w:eastAsia="Times New Roman" w:hAnsi="Consolas" w:cs="Times New Roman"/>
+          <w:color w:val="CE9178"/>
+          <w:kern w:val="0"/>
+          <w:sz w:val="21"/>
+          <w:szCs w:val="21"/>
+          <w:lang w:eastAsia="en-GB"/>
+          <w14:ligatures w14:val="none"/>
+        </w:rPr>
+        <w:t>#CFCFCF</w:t>
+      </w:r>
+      <w:r>
+        <w:rPr>
+          <w:rFonts w:ascii="Consolas" w:eastAsia="Times New Roman" w:hAnsi="Consolas" w:cs="Times New Roman"/>
+          <w:color w:val="BBBEBF"/>
+          <w:kern w:val="0"/>
+          <w:sz w:val="21"/>
+          <w:szCs w:val="21"/>
+          <w:lang w:eastAsia="en-GB"/>
+          <w14:ligatures w14:val="none"/>
+        </w:rPr>
+        <w:t>;</w:t>
+      </w:r>
+    </w:p>
+    <w:p>
+      <w:pPr>
+        <w:pStyle w:val="ListParagraph"/>
+        <w:numPr>
+          <w:ilvl w:val="0"/>
+          <w:numId w:val="6"/>
+        </w:numPr>
+        <w:shd w:val="clear" w:color="auto" w:fill="121314"/>
+        <w:spacing w:after="0" w:line="285" w:lineRule="atLeast"/>
+        <w:rPr>
+          <w:rFonts w:ascii="Consolas" w:eastAsia="Times New Roman" w:hAnsi="Consolas" w:cs="Times New Roman"/>
+          <w:color w:val="BBBEBF"/>
+          <w:kern w:val="0"/>
+          <w:sz w:val="21"/>
+          <w:szCs w:val="21"/>
+          <w:lang w:eastAsia="en-GB"/>
+          <w14:ligatures w14:val="none"/>
+        </w:rPr>
+      </w:pPr>
+    </w:p>
+    <w:p>
+      <w:pPr>
+        <w:pStyle w:val="ListParagraph"/>
+        <w:numPr>
+          <w:ilvl w:val="0"/>
+          <w:numId w:val="6"/>
+        </w:numPr>
+        <w:shd w:val="clear" w:color="auto" w:fill="121314"/>
+        <w:spacing w:after="0" w:line="285" w:lineRule="atLeast"/>
+        <w:rPr>
+          <w:rFonts w:ascii="Consolas" w:eastAsia="Times New Roman" w:hAnsi="Consolas" w:cs="Times New Roman"/>
+          <w:color w:val="BBBEBF"/>
+          <w:kern w:val="0"/>
+          <w:sz w:val="21"/>
+          <w:szCs w:val="21"/>
+          <w:lang w:eastAsia="en-GB"/>
+          <w14:ligatures w14:val="none"/>
+        </w:rPr>
+      </w:pPr>
+      <w:r>
+        <w:rPr>
+          <w:rFonts w:ascii="Consolas" w:eastAsia="Times New Roman" w:hAnsi="Consolas" w:cs="Times New Roman"/>
+          <w:color w:val="BBBEBF"/>
+          <w:kern w:val="0"/>
+          <w:sz w:val="21"/>
+          <w:szCs w:val="21"/>
+          <w:lang w:eastAsia="en-GB"/>
+          <w14:ligatures w14:val="none"/>
+        </w:rPr>
+        <w:t xml:space="preserve">  </w:t>
+      </w:r>
+      <w:r>
+        <w:rPr>
+          <w:rFonts w:ascii="Consolas" w:eastAsia="Times New Roman" w:hAnsi="Consolas" w:cs="Times New Roman"/>
+          <w:color w:val="9CDCFE"/>
+          <w:kern w:val="0"/>
+          <w:sz w:val="21"/>
+          <w:szCs w:val="21"/>
+          <w:lang w:eastAsia="en-GB"/>
+          <w14:ligatures w14:val="none"/>
+        </w:rPr>
+        <w:t>--color-border</w:t>
+      </w:r>
+      <w:r>
+        <w:rPr>
+          <w:rFonts w:ascii="Consolas" w:eastAsia="Times New Roman" w:hAnsi="Consolas" w:cs="Times New Roman"/>
+          <w:color w:val="BBBEBF"/>
+          <w:kern w:val="0"/>
+          <w:sz w:val="21"/>
+          <w:szCs w:val="21"/>
+          <w:lang w:eastAsia="en-GB"/>
+          <w14:ligatures w14:val="none"/>
+        </w:rPr>
+        <w:t xml:space="preserve">: </w:t>
+      </w:r>
+      <w:r>
+        <w:rPr>
+          <w:rFonts w:ascii="Consolas" w:eastAsia="Times New Roman" w:hAnsi="Consolas" w:cs="Times New Roman"/>
+          <w:color w:val="CE9178"/>
+          <w:kern w:val="0"/>
+          <w:sz w:val="21"/>
+          <w:szCs w:val="21"/>
+          <w:lang w:eastAsia="en-GB"/>
+          <w14:ligatures w14:val="none"/>
+        </w:rPr>
+        <w:t>#3A3A3A</w:t>
+      </w:r>
+      <w:r>
+        <w:rPr>
+          <w:rFonts w:ascii="Consolas" w:eastAsia="Times New Roman" w:hAnsi="Consolas" w:cs="Times New Roman"/>
+          <w:color w:val="BBBEBF"/>
+          <w:kern w:val="0"/>
+          <w:sz w:val="21"/>
+          <w:szCs w:val="21"/>
+          <w:lang w:eastAsia="en-GB"/>
+          <w14:ligatures w14:val="none"/>
+        </w:rPr>
+        <w:t>;</w:t>
+      </w:r>
+    </w:p>
+    <w:p>
+      <w:pPr>
+        <w:pStyle w:val="ListParagraph"/>
+        <w:numPr>
+          <w:ilvl w:val="0"/>
+          <w:numId w:val="6"/>
+        </w:numPr>
+        <w:shd w:val="clear" w:color="auto" w:fill="121314"/>
+        <w:spacing w:after="0" w:line="285" w:lineRule="atLeast"/>
+        <w:rPr>
+          <w:rFonts w:ascii="Consolas" w:eastAsia="Times New Roman" w:hAnsi="Consolas" w:cs="Times New Roman"/>
+          <w:color w:val="BBBEBF"/>
+          <w:kern w:val="0"/>
+          <w:sz w:val="21"/>
+          <w:szCs w:val="21"/>
+          <w:lang w:eastAsia="en-GB"/>
+          <w14:ligatures w14:val="none"/>
+        </w:rPr>
+      </w:pPr>
+    </w:p>
+    <w:p>
+      <w:pPr>
+        <w:pStyle w:val="ListParagraph"/>
+        <w:numPr>
+          <w:ilvl w:val="0"/>
+          <w:numId w:val="6"/>
+        </w:numPr>
+        <w:shd w:val="clear" w:color="auto" w:fill="121314"/>
+        <w:spacing w:after="0" w:line="285" w:lineRule="atLeast"/>
+        <w:rPr>
+          <w:rFonts w:ascii="Consolas" w:eastAsia="Times New Roman" w:hAnsi="Consolas" w:cs="Times New Roman"/>
+          <w:color w:val="BBBEBF"/>
+          <w:kern w:val="0"/>
+          <w:sz w:val="21"/>
+          <w:szCs w:val="21"/>
+          <w:lang w:eastAsia="en-GB"/>
+          <w14:ligatures w14:val="none"/>
+        </w:rPr>
+      </w:pPr>
+      <w:r>
+        <w:rPr>
+          <w:rFonts w:ascii="Consolas" w:eastAsia="Times New Roman" w:hAnsi="Consolas" w:cs="Times New Roman"/>
+          <w:color w:val="BBBEBF"/>
+          <w:kern w:val="0"/>
+          <w:sz w:val="21"/>
+          <w:szCs w:val="21"/>
+          <w:lang w:eastAsia="en-GB"/>
+          <w14:ligatures w14:val="none"/>
+        </w:rPr>
+        <w:t xml:space="preserve">  </w:t>
+      </w:r>
+      <w:r>
+        <w:rPr>
+          <w:rFonts w:ascii="Consolas" w:eastAsia="Times New Roman" w:hAnsi="Consolas" w:cs="Times New Roman"/>
+          <w:color w:val="9CDCFE"/>
+          <w:kern w:val="0"/>
+          <w:sz w:val="21"/>
+          <w:szCs w:val="21"/>
+          <w:lang w:eastAsia="en-GB"/>
+          <w14:ligatures w14:val="none"/>
+        </w:rPr>
+        <w:t>--color-accent</w:t>
+      </w:r>
+      <w:r>
+        <w:rPr>
+          <w:rFonts w:ascii="Consolas" w:eastAsia="Times New Roman" w:hAnsi="Consolas" w:cs="Times New Roman"/>
+          <w:color w:val="BBBEBF"/>
+          <w:kern w:val="0"/>
+          <w:sz w:val="21"/>
+          <w:szCs w:val="21"/>
+          <w:lang w:eastAsia="en-GB"/>
+          <w14:ligatures w14:val="none"/>
+        </w:rPr>
+        <w:t xml:space="preserve">: </w:t>
+      </w:r>
+      <w:r>
+        <w:rPr>
+          <w:rFonts w:ascii="Consolas" w:eastAsia="Times New Roman" w:hAnsi="Consolas" w:cs="Times New Roman"/>
+          <w:color w:val="CE9178"/>
+          <w:kern w:val="0"/>
+          <w:sz w:val="21"/>
+          <w:szCs w:val="21"/>
+          <w:lang w:eastAsia="en-GB"/>
+          <w14:ligatures w14:val="none"/>
+        </w:rPr>
+        <w:t>#0077FF</w:t>
+      </w:r>
+      <w:r>
+        <w:rPr>
+          <w:rFonts w:ascii="Consolas" w:eastAsia="Times New Roman" w:hAnsi="Consolas" w:cs="Times New Roman"/>
+          <w:color w:val="BBBEBF"/>
+          <w:kern w:val="0"/>
+          <w:sz w:val="21"/>
+          <w:szCs w:val="21"/>
+          <w:lang w:eastAsia="en-GB"/>
+          <w14:ligatures w14:val="none"/>
+        </w:rPr>
+        <w:t xml:space="preserve">; </w:t>
+      </w:r>
+      <w:r>
+        <w:rPr>
+          <w:rFonts w:ascii="Consolas" w:eastAsia="Times New Roman" w:hAnsi="Consolas" w:cs="Times New Roman"/>
+          <w:color w:val="8B949E"/>
+          <w:kern w:val="0"/>
+          <w:sz w:val="21"/>
+          <w:szCs w:val="21"/>
+          <w:lang w:eastAsia="en-GB"/>
+          <w14:ligatures w14:val="none"/>
+        </w:rPr>
+        <w:t>/* Electric Blue */</w:t>
+      </w:r>
+    </w:p>
+    <w:p>
+      <w:pPr>
+        <w:pStyle w:val="ListParagraph"/>
+        <w:numPr>
+          <w:ilvl w:val="0"/>
+          <w:numId w:val="6"/>
+        </w:numPr>
+        <w:shd w:val="clear" w:color="auto" w:fill="121314"/>
+        <w:spacing w:after="0" w:line="285" w:lineRule="atLeast"/>
+        <w:rPr>
+          <w:rFonts w:ascii="Consolas" w:eastAsia="Times New Roman" w:hAnsi="Consolas" w:cs="Times New Roman"/>
+          <w:color w:val="BBBEBF"/>
+          <w:kern w:val="0"/>
+          <w:sz w:val="21"/>
+          <w:szCs w:val="21"/>
+          <w:lang w:eastAsia="en-GB"/>
+          <w14:ligatures w14:val="none"/>
+        </w:rPr>
+      </w:pPr>
+      <w:r>
+        <w:rPr>
+          <w:rFonts w:ascii="Consolas" w:eastAsia="Times New Roman" w:hAnsi="Consolas" w:cs="Times New Roman"/>
+          <w:color w:val="BBBEBF"/>
+          <w:kern w:val="0"/>
+          <w:sz w:val="21"/>
+          <w:szCs w:val="21"/>
+          <w:lang w:eastAsia="en-GB"/>
+          <w14:ligatures w14:val="none"/>
+        </w:rPr>
+        <w:t xml:space="preserve">  </w:t>
+      </w:r>
+      <w:r>
+        <w:rPr>
+          <w:rFonts w:ascii="Consolas" w:eastAsia="Times New Roman" w:hAnsi="Consolas" w:cs="Times New Roman"/>
+          <w:color w:val="9CDCFE"/>
+          <w:kern w:val="0"/>
+          <w:sz w:val="21"/>
+          <w:szCs w:val="21"/>
+          <w:lang w:eastAsia="en-GB"/>
+          <w14:ligatures w14:val="none"/>
+        </w:rPr>
+        <w:t>--color-accent-hover</w:t>
+      </w:r>
+      <w:r>
+        <w:rPr>
+          <w:rFonts w:ascii="Consolas" w:eastAsia="Times New Roman" w:hAnsi="Consolas" w:cs="Times New Roman"/>
+          <w:color w:val="BBBEBF"/>
+          <w:kern w:val="0"/>
+          <w:sz w:val="21"/>
+          <w:szCs w:val="21"/>
+          <w:lang w:eastAsia="en-GB"/>
+          <w14:ligatures w14:val="none"/>
+        </w:rPr>
+        <w:t xml:space="preserve">: </w:t>
+      </w:r>
+      <w:r>
+        <w:rPr>
+          <w:rFonts w:ascii="Consolas" w:eastAsia="Times New Roman" w:hAnsi="Consolas" w:cs="Times New Roman"/>
+          <w:color w:val="CE9178"/>
+          <w:kern w:val="0"/>
+          <w:sz w:val="21"/>
+          <w:szCs w:val="21"/>
+          <w:lang w:eastAsia="en-GB"/>
+          <w14:ligatures w14:val="none"/>
+        </w:rPr>
+        <w:t>#3399FF</w:t>
+      </w:r>
+      <w:r>
+        <w:rPr>
+          <w:rFonts w:ascii="Consolas" w:eastAsia="Times New Roman" w:hAnsi="Consolas" w:cs="Times New Roman"/>
+          <w:color w:val="BBBEBF"/>
+          <w:kern w:val="0"/>
+          <w:sz w:val="21"/>
+          <w:szCs w:val="21"/>
+          <w:lang w:eastAsia="en-GB"/>
+          <w14:ligatures w14:val="none"/>
+        </w:rPr>
+        <w:t>;</w:t>
+      </w:r>
+    </w:p>
+    <w:p>
+      <w:pPr>
+        <w:pStyle w:val="ListParagraph"/>
+        <w:numPr>
+          <w:ilvl w:val="0"/>
+          <w:numId w:val="6"/>
+        </w:numPr>
+        <w:shd w:val="clear" w:color="auto" w:fill="121314"/>
+        <w:spacing w:after="0" w:line="285" w:lineRule="atLeast"/>
+        <w:rPr>
+          <w:rFonts w:ascii="Consolas" w:eastAsia="Times New Roman" w:hAnsi="Consolas" w:cs="Times New Roman"/>
+          <w:color w:val="BBBEBF"/>
+          <w:kern w:val="0"/>
+          <w:sz w:val="21"/>
+          <w:szCs w:val="21"/>
+          <w:lang w:eastAsia="en-GB"/>
+          <w14:ligatures w14:val="none"/>
+        </w:rPr>
+      </w:pPr>
+    </w:p>
+    <w:p>
+      <w:pPr>
+        <w:pStyle w:val="ListParagraph"/>
+        <w:numPr>
+          <w:ilvl w:val="0"/>
+          <w:numId w:val="6"/>
+        </w:numPr>
+        <w:shd w:val="clear" w:color="auto" w:fill="121314"/>
+        <w:spacing w:after="0" w:line="285" w:lineRule="atLeast"/>
+        <w:rPr>
+          <w:rFonts w:ascii="Consolas" w:eastAsia="Times New Roman" w:hAnsi="Consolas" w:cs="Times New Roman"/>
+          <w:color w:val="BBBEBF"/>
+          <w:kern w:val="0"/>
+          <w:sz w:val="21"/>
+          <w:szCs w:val="21"/>
+          <w:lang w:eastAsia="en-GB"/>
+          <w14:ligatures w14:val="none"/>
+        </w:rPr>
+      </w:pPr>
+      <w:r>
+        <w:rPr>
+          <w:rFonts w:ascii="Consolas" w:eastAsia="Times New Roman" w:hAnsi="Consolas" w:cs="Times New Roman"/>
+          <w:color w:val="BBBEBF"/>
+          <w:kern w:val="0"/>
+          <w:sz w:val="21"/>
+          <w:szCs w:val="21"/>
+          <w:lang w:eastAsia="en-GB"/>
+          <w14:ligatures w14:val="none"/>
+        </w:rPr>
+        <w:t xml:space="preserve">  </w:t>
+      </w:r>
+      <w:r>
+        <w:rPr>
+          <w:rFonts w:ascii="Consolas" w:eastAsia="Times New Roman" w:hAnsi="Consolas" w:cs="Times New Roman"/>
+          <w:color w:val="9CDCFE"/>
+          <w:kern w:val="0"/>
+          <w:sz w:val="21"/>
+          <w:szCs w:val="21"/>
+          <w:lang w:eastAsia="en-GB"/>
+          <w14:ligatures w14:val="none"/>
+        </w:rPr>
+        <w:t>--color-danger</w:t>
+      </w:r>
+      <w:r>
+        <w:rPr>
+          <w:rFonts w:ascii="Consolas" w:eastAsia="Times New Roman" w:hAnsi="Consolas" w:cs="Times New Roman"/>
+          <w:color w:val="BBBEBF"/>
+          <w:kern w:val="0"/>
+          <w:sz w:val="21"/>
+          <w:szCs w:val="21"/>
+          <w:lang w:eastAsia="en-GB"/>
+          <w14:ligatures w14:val="none"/>
+        </w:rPr>
+        <w:t xml:space="preserve">: </w:t>
+      </w:r>
+      <w:r>
+        <w:rPr>
+          <w:rFonts w:ascii="Consolas" w:eastAsia="Times New Roman" w:hAnsi="Consolas" w:cs="Times New Roman"/>
+          <w:color w:val="CE9178"/>
+          <w:kern w:val="0"/>
+          <w:sz w:val="21"/>
+          <w:szCs w:val="21"/>
+          <w:lang w:eastAsia="en-GB"/>
+          <w14:ligatures w14:val="none"/>
+        </w:rPr>
+        <w:t>#E50914</w:t>
+      </w:r>
+      <w:r>
+        <w:rPr>
+          <w:rFonts w:ascii="Consolas" w:eastAsia="Times New Roman" w:hAnsi="Consolas" w:cs="Times New Roman"/>
+          <w:color w:val="BBBEBF"/>
+          <w:kern w:val="0"/>
+          <w:sz w:val="21"/>
+          <w:szCs w:val="21"/>
+          <w:lang w:eastAsia="en-GB"/>
+          <w14:ligatures w14:val="none"/>
+        </w:rPr>
+        <w:t xml:space="preserve">; </w:t>
+      </w:r>
+      <w:r>
+        <w:rPr>
+          <w:rFonts w:ascii="Consolas" w:eastAsia="Times New Roman" w:hAnsi="Consolas" w:cs="Times New Roman"/>
+          <w:color w:val="8B949E"/>
+          <w:kern w:val="0"/>
+          <w:sz w:val="21"/>
+          <w:szCs w:val="21"/>
+          <w:lang w:eastAsia="en-GB"/>
+          <w14:ligatures w14:val="none"/>
+        </w:rPr>
+        <w:t>/* Netflix Red */</w:t>
+      </w:r>
+    </w:p>
+    <w:p>
+      <w:pPr>
+        <w:pStyle w:val="ListParagraph"/>
+        <w:numPr>
+          <w:ilvl w:val="0"/>
+          <w:numId w:val="6"/>
+        </w:numPr>
+        <w:shd w:val="clear" w:color="auto" w:fill="121314"/>
+        <w:spacing w:after="0" w:line="285" w:lineRule="atLeast"/>
+        <w:rPr>
+          <w:rFonts w:ascii="Consolas" w:eastAsia="Times New Roman" w:hAnsi="Consolas" w:cs="Times New Roman"/>
+          <w:color w:val="BBBEBF"/>
+          <w:kern w:val="0"/>
+          <w:sz w:val="21"/>
+          <w:szCs w:val="21"/>
+          <w:lang w:eastAsia="en-GB"/>
+          <w14:ligatures w14:val="none"/>
+        </w:rPr>
+      </w:pPr>
+      <w:r>
+        <w:rPr>
+          <w:rFonts w:ascii="Consolas" w:eastAsia="Times New Roman" w:hAnsi="Consolas" w:cs="Times New Roman"/>
+          <w:color w:val="BBBEBF"/>
+          <w:kern w:val="0"/>
+          <w:sz w:val="21"/>
+          <w:szCs w:val="21"/>
+          <w:lang w:eastAsia="en-GB"/>
+          <w14:ligatures w14:val="none"/>
+        </w:rPr>
+        <w:t xml:space="preserve">  </w:t>
+      </w:r>
+      <w:r>
+        <w:rPr>
+          <w:rFonts w:ascii="Consolas" w:eastAsia="Times New Roman" w:hAnsi="Consolas" w:cs="Times New Roman"/>
+          <w:color w:val="9CDCFE"/>
+          <w:kern w:val="0"/>
+          <w:sz w:val="21"/>
+          <w:szCs w:val="21"/>
+          <w:lang w:eastAsia="en-GB"/>
+          <w14:ligatures w14:val="none"/>
+        </w:rPr>
+        <w:t>--color-warning</w:t>
+      </w:r>
+      <w:r>
+        <w:rPr>
+          <w:rFonts w:ascii="Consolas" w:eastAsia="Times New Roman" w:hAnsi="Consolas" w:cs="Times New Roman"/>
+          <w:color w:val="BBBEBF"/>
+          <w:kern w:val="0"/>
+          <w:sz w:val="21"/>
+          <w:szCs w:val="21"/>
+          <w:lang w:eastAsia="en-GB"/>
+          <w14:ligatures w14:val="none"/>
+        </w:rPr>
+        <w:t xml:space="preserve">: </w:t>
+      </w:r>
+      <w:r>
+        <w:rPr>
+          <w:rFonts w:ascii="Consolas" w:eastAsia="Times New Roman" w:hAnsi="Consolas" w:cs="Times New Roman"/>
+          <w:color w:val="CE9178"/>
+          <w:kern w:val="0"/>
+          <w:sz w:val="21"/>
+          <w:szCs w:val="21"/>
+          <w:lang w:eastAsia="en-GB"/>
+          <w14:ligatures w14:val="none"/>
+        </w:rPr>
+        <w:t>#F2C94C</w:t>
+      </w:r>
+      <w:r>
+        <w:rPr>
+          <w:rFonts w:ascii="Consolas" w:eastAsia="Times New Roman" w:hAnsi="Consolas" w:cs="Times New Roman"/>
+          <w:color w:val="BBBEBF"/>
+          <w:kern w:val="0"/>
+          <w:sz w:val="21"/>
+          <w:szCs w:val="21"/>
+          <w:lang w:eastAsia="en-GB"/>
+          <w14:ligatures w14:val="none"/>
+        </w:rPr>
+        <w:t xml:space="preserve">; </w:t>
+      </w:r>
+      <w:r>
+        <w:rPr>
+          <w:rFonts w:ascii="Consolas" w:eastAsia="Times New Roman" w:hAnsi="Consolas" w:cs="Times New Roman"/>
+          <w:color w:val="8B949E"/>
+          <w:kern w:val="0"/>
+          <w:sz w:val="21"/>
+          <w:szCs w:val="21"/>
+          <w:lang w:eastAsia="en-GB"/>
+          <w14:ligatures w14:val="none"/>
+        </w:rPr>
+        <w:t>/* Gold */</w:t>
+      </w:r>
+    </w:p>
+    <w:p>
+      <w:pPr>
+        <w:pStyle w:val="ListParagraph"/>
+        <w:numPr>
+          <w:ilvl w:val="0"/>
+          <w:numId w:val="6"/>
+        </w:numPr>
+        <w:shd w:val="clear" w:color="auto" w:fill="121314"/>
+        <w:spacing w:after="0" w:line="285" w:lineRule="atLeast"/>
+        <w:rPr>
+          <w:rFonts w:ascii="Consolas" w:eastAsia="Times New Roman" w:hAnsi="Consolas" w:cs="Times New Roman"/>
+          <w:color w:val="BBBEBF"/>
+          <w:kern w:val="0"/>
+          <w:sz w:val="21"/>
+          <w:szCs w:val="21"/>
+          <w:lang w:eastAsia="en-GB"/>
+          <w14:ligatures w14:val="none"/>
+        </w:rPr>
+      </w:pPr>
+      <w:r>
+        <w:rPr>
+          <w:rFonts w:ascii="Consolas" w:eastAsia="Times New Roman" w:hAnsi="Consolas" w:cs="Times New Roman"/>
+          <w:color w:val="BBBEBF"/>
+          <w:kern w:val="0"/>
+          <w:sz w:val="21"/>
+          <w:szCs w:val="21"/>
+          <w:lang w:eastAsia="en-GB"/>
+          <w14:ligatures w14:val="none"/>
+        </w:rPr>
+        <w:t>}</w:t>
+      </w:r>
+    </w:p>
+    <w:p>
+      <w:pPr>
+        <w:pStyle w:val="ListParagraph"/>
+        <w:numPr>
+          <w:ilvl w:val="0"/>
+          <w:numId w:val="6"/>
+        </w:numPr>
+        <w:shd w:val="clear" w:color="auto" w:fill="121314"/>
+        <w:spacing w:after="0" w:line="285" w:lineRule="atLeast"/>
+        <w:rPr>
+          <w:rFonts w:ascii="Consolas" w:eastAsia="Times New Roman" w:hAnsi="Consolas" w:cs="Times New Roman"/>
+          <w:color w:val="BBBEBF"/>
+          <w:kern w:val="0"/>
+          <w:sz w:val="21"/>
+          <w:szCs w:val="21"/>
+          <w:lang w:eastAsia="en-GB"/>
+          <w14:ligatures w14:val="none"/>
+        </w:rPr>
+      </w:pPr>
+    </w:p>
+    <w:p>
+      <w:pPr>
+        <w:pStyle w:val="ListParagraph"/>
+        <w:numPr>
+          <w:ilvl w:val="0"/>
+          <w:numId w:val="6"/>
+        </w:numPr>
+        <w:shd w:val="clear" w:color="auto" w:fill="121314"/>
+        <w:spacing w:after="0" w:line="285" w:lineRule="atLeast"/>
+        <w:rPr>
+          <w:rFonts w:ascii="Consolas" w:eastAsia="Times New Roman" w:hAnsi="Consolas" w:cs="Times New Roman"/>
+          <w:color w:val="BBBEBF"/>
+          <w:kern w:val="0"/>
+          <w:sz w:val="21"/>
+          <w:szCs w:val="21"/>
+          <w:lang w:eastAsia="en-GB"/>
+          <w14:ligatures w14:val="none"/>
+        </w:rPr>
+      </w:pPr>
+      <w:r>
+        <w:rPr>
+          <w:rFonts w:ascii="Consolas" w:eastAsia="Times New Roman" w:hAnsi="Consolas" w:cs="Times New Roman"/>
+          <w:color w:val="8B949E"/>
+          <w:kern w:val="0"/>
+          <w:sz w:val="21"/>
+          <w:szCs w:val="21"/>
+          <w:lang w:eastAsia="en-GB"/>
+          <w14:ligatures w14:val="none"/>
+        </w:rPr>
+        <w:t>/*Navbar No Wrap*/</w:t>
+      </w:r>
+    </w:p>
+    <w:p>
+      <w:pPr>
+        <w:pStyle w:val="ListParagraph"/>
+        <w:numPr>
+          <w:ilvl w:val="0"/>
+          <w:numId w:val="6"/>
+        </w:numPr>
+        <w:shd w:val="clear" w:color="auto" w:fill="121314"/>
+        <w:spacing w:after="0" w:line="285" w:lineRule="atLeast"/>
+        <w:rPr>
+          <w:rFonts w:ascii="Consolas" w:eastAsia="Times New Roman" w:hAnsi="Consolas" w:cs="Times New Roman"/>
+          <w:color w:val="BBBEBF"/>
+          <w:kern w:val="0"/>
+          <w:sz w:val="21"/>
+          <w:szCs w:val="21"/>
+          <w:lang w:eastAsia="en-GB"/>
+          <w14:ligatures w14:val="none"/>
+        </w:rPr>
+      </w:pPr>
+      <w:r>
+        <w:rPr>
+          <w:rFonts w:ascii="Consolas" w:eastAsia="Times New Roman" w:hAnsi="Consolas" w:cs="Times New Roman"/>
+          <w:color w:val="D7BA7D"/>
+          <w:kern w:val="0"/>
+          <w:sz w:val="21"/>
+          <w:szCs w:val="21"/>
+          <w:lang w:eastAsia="en-GB"/>
+          <w14:ligatures w14:val="none"/>
+        </w:rPr>
+        <w:t>.navbar-nav</w:t>
+      </w:r>
+      <w:r>
+        <w:rPr>
+          <w:rFonts w:ascii="Consolas" w:eastAsia="Times New Roman" w:hAnsi="Consolas" w:cs="Times New Roman"/>
+          <w:color w:val="BBBEBF"/>
+          <w:kern w:val="0"/>
+          <w:sz w:val="21"/>
+          <w:szCs w:val="21"/>
+          <w:lang w:eastAsia="en-GB"/>
+          <w14:ligatures w14:val="none"/>
+        </w:rPr>
+        <w:t xml:space="preserve"> </w:t>
+      </w:r>
+      <w:r>
+        <w:rPr>
+          <w:rFonts w:ascii="Consolas" w:eastAsia="Times New Roman" w:hAnsi="Consolas" w:cs="Times New Roman"/>
+          <w:color w:val="D7BA7D"/>
+          <w:kern w:val="0"/>
+          <w:sz w:val="21"/>
+          <w:szCs w:val="21"/>
+          <w:lang w:eastAsia="en-GB"/>
+          <w14:ligatures w14:val="none"/>
+        </w:rPr>
+        <w:t>.nav-link</w:t>
+      </w:r>
+      <w:r>
+        <w:rPr>
+          <w:rFonts w:ascii="Consolas" w:eastAsia="Times New Roman" w:hAnsi="Consolas" w:cs="Times New Roman"/>
+          <w:color w:val="BBBEBF"/>
+          <w:kern w:val="0"/>
+          <w:sz w:val="21"/>
+          <w:szCs w:val="21"/>
+          <w:lang w:eastAsia="en-GB"/>
+          <w14:ligatures w14:val="none"/>
+        </w:rPr>
+        <w:t xml:space="preserve"> {</w:t>
+      </w:r>
+    </w:p>
+    <w:p>
+      <w:pPr>
+        <w:pStyle w:val="ListParagraph"/>
+        <w:numPr>
+          <w:ilvl w:val="0"/>
+          <w:numId w:val="6"/>
+        </w:numPr>
+        <w:shd w:val="clear" w:color="auto" w:fill="121314"/>
+        <w:spacing w:after="0" w:line="285" w:lineRule="atLeast"/>
+        <w:rPr>
+          <w:rFonts w:ascii="Consolas" w:eastAsia="Times New Roman" w:hAnsi="Consolas" w:cs="Times New Roman"/>
+          <w:color w:val="BBBEBF"/>
+          <w:kern w:val="0"/>
+          <w:sz w:val="21"/>
+          <w:szCs w:val="21"/>
+          <w:lang w:eastAsia="en-GB"/>
+          <w14:ligatures w14:val="none"/>
+        </w:rPr>
+      </w:pPr>
+      <w:r>
+        <w:rPr>
+          <w:rFonts w:ascii="Consolas" w:eastAsia="Times New Roman" w:hAnsi="Consolas" w:cs="Times New Roman"/>
+          <w:color w:val="BBBEBF"/>
+          <w:kern w:val="0"/>
+          <w:sz w:val="21"/>
+          <w:szCs w:val="21"/>
+          <w:lang w:eastAsia="en-GB"/>
+          <w14:ligatures w14:val="none"/>
+        </w:rPr>
+        <w:t xml:space="preserve">    </w:t>
+      </w:r>
+      <w:r>
+        <w:rPr>
+          <w:rFonts w:ascii="Consolas" w:eastAsia="Times New Roman" w:hAnsi="Consolas" w:cs="Times New Roman"/>
+          <w:color w:val="9CDCFE"/>
+          <w:kern w:val="0"/>
+          <w:sz w:val="21"/>
+          <w:szCs w:val="21"/>
+          <w:lang w:eastAsia="en-GB"/>
+          <w14:ligatures w14:val="none"/>
+        </w:rPr>
+        <w:t>white-space</w:t>
+      </w:r>
+      <w:r>
+        <w:rPr>
+          <w:rFonts w:ascii="Consolas" w:eastAsia="Times New Roman" w:hAnsi="Consolas" w:cs="Times New Roman"/>
+          <w:color w:val="BBBEBF"/>
+          <w:kern w:val="0"/>
+          <w:sz w:val="21"/>
+          <w:szCs w:val="21"/>
+          <w:lang w:eastAsia="en-GB"/>
+          <w14:ligatures w14:val="none"/>
+        </w:rPr>
+        <w:t xml:space="preserve">: </w:t>
+      </w:r>
+      <w:r>
+        <w:rPr>
+          <w:rFonts w:ascii="Consolas" w:eastAsia="Times New Roman" w:hAnsi="Consolas" w:cs="Times New Roman"/>
+          <w:color w:val="CE9178"/>
+          <w:kern w:val="0"/>
+          <w:sz w:val="21"/>
+          <w:szCs w:val="21"/>
+          <w:lang w:eastAsia="en-GB"/>
+          <w14:ligatures w14:val="none"/>
+        </w:rPr>
+        <w:t>nowrap</w:t>
+      </w:r>
+      <w:r>
+        <w:rPr>
+          <w:rFonts w:ascii="Consolas" w:eastAsia="Times New Roman" w:hAnsi="Consolas" w:cs="Times New Roman"/>
+          <w:color w:val="BBBEBF"/>
+          <w:kern w:val="0"/>
+          <w:sz w:val="21"/>
+          <w:szCs w:val="21"/>
+          <w:lang w:eastAsia="en-GB"/>
+          <w14:ligatures w14:val="none"/>
+        </w:rPr>
+        <w:t>;</w:t>
+      </w:r>
+    </w:p>
+    <w:p>
+      <w:pPr>
+        <w:pStyle w:val="ListParagraph"/>
+        <w:numPr>
+          <w:ilvl w:val="0"/>
+          <w:numId w:val="6"/>
+        </w:numPr>
+        <w:shd w:val="clear" w:color="auto" w:fill="121314"/>
+        <w:spacing w:after="0" w:line="285" w:lineRule="atLeast"/>
+        <w:rPr>
+          <w:rFonts w:ascii="Consolas" w:eastAsia="Times New Roman" w:hAnsi="Consolas" w:cs="Times New Roman"/>
+          <w:color w:val="BBBEBF"/>
+          <w:kern w:val="0"/>
+          <w:sz w:val="21"/>
+          <w:szCs w:val="21"/>
+          <w:lang w:eastAsia="en-GB"/>
+          <w14:ligatures w14:val="none"/>
+        </w:rPr>
+      </w:pPr>
+      <w:r>
+        <w:rPr>
+          <w:rFonts w:ascii="Consolas" w:eastAsia="Times New Roman" w:hAnsi="Consolas" w:cs="Times New Roman"/>
+          <w:color w:val="BBBEBF"/>
+          <w:kern w:val="0"/>
+          <w:sz w:val="21"/>
+          <w:szCs w:val="21"/>
+          <w:lang w:eastAsia="en-GB"/>
+          <w14:ligatures w14:val="none"/>
+        </w:rPr>
+        <w:t>}</w:t>
+      </w:r>
+    </w:p>
+    <w:p>
+      <w:pPr>
+        <w:pStyle w:val="ListParagraph"/>
+        <w:numPr>
+          <w:ilvl w:val="0"/>
+          <w:numId w:val="6"/>
+        </w:numPr>
+        <w:shd w:val="clear" w:color="auto" w:fill="121314"/>
+        <w:spacing w:after="0" w:line="285" w:lineRule="atLeast"/>
+        <w:rPr>
+          <w:rFonts w:ascii="Consolas" w:eastAsia="Times New Roman" w:hAnsi="Consolas" w:cs="Times New Roman"/>
+          <w:color w:val="BBBEBF"/>
+          <w:kern w:val="0"/>
+          <w:sz w:val="21"/>
+          <w:szCs w:val="21"/>
+          <w:lang w:eastAsia="en-GB"/>
+          <w14:ligatures w14:val="none"/>
+        </w:rPr>
+      </w:pPr>
+    </w:p>
+    <w:p>
+      <w:pPr>
+        <w:spacing w:before="100" w:beforeAutospacing="1" w:after="100" w:afterAutospacing="1" w:line="240" w:lineRule="auto"/>
+        <w:rPr>
+          <w:rFonts w:ascii="Meiryo" w:eastAsia="Meiryo" w:hAnsi="Meiryo" w:cs="Times New Roman"/>
+          <w:kern w:val="0"/>
+          <w:lang w:eastAsia="en-GB"/>
+          <w14:ligatures w14:val="none"/>
+        </w:rPr>
+      </w:pPr>
     </w:p>
     <w:p>
       <w:pPr>

</xml_diff>